<commit_message>
FEAT/DOC - update doc
</commit_message>
<xml_diff>
--- a/doc/2025_08_01 edf.docx
+++ b/doc/2025_08_01 edf.docx
@@ -2,6 +2,14 @@
 <file path=word/document.xml><?xml version="1.0" encoding="utf-8"?>
 <w:document xmlns:wpc="http://schemas.microsoft.com/office/word/2010/wordprocessingCanvas" xmlns:cx="http://schemas.microsoft.com/office/drawing/2014/chartex" xmlns:cx1="http://schemas.microsoft.com/office/drawing/2015/9/8/chartex" xmlns:cx2="http://schemas.microsoft.com/office/drawing/2015/10/21/chartex" xmlns:cx3="http://schemas.microsoft.com/office/drawing/2016/5/9/chartex" xmlns:cx4="http://schemas.microsoft.com/office/drawing/2016/5/10/chartex" xmlns:cx5="http://schemas.microsoft.com/office/drawing/2016/5/11/chartex" xmlns:cx6="http://schemas.microsoft.com/office/drawing/2016/5/12/chartex" xmlns:cx7="http://schemas.microsoft.com/office/drawing/2016/5/13/chartex" xmlns:cx8="http://schemas.microsoft.com/office/drawing/2016/5/14/chartex" xmlns:mc="http://schemas.openxmlformats.org/markup-compatibility/2006" xmlns:aink="http://schemas.microsoft.com/office/drawing/2016/ink" xmlns:am3d="http://schemas.microsoft.com/office/drawing/2017/model3d" xmlns:o="urn:schemas-microsoft-com:office:office" xmlns:oel="http://schemas.microsoft.com/office/2019/extlst" xmlns:r="http://schemas.openxmlformats.org/officeDocument/2006/relationships" xmlns:m="http://schemas.openxmlformats.org/officeDocument/2006/math" xmlns:v="urn:schemas-microsoft-com:vml" xmlns:wp14="http://schemas.microsoft.com/office/word/2010/wordprocessingDrawing" xmlns:wp="http://schemas.openxmlformats.org/drawingml/2006/wordprocessingDrawing" xmlns:w10="urn:schemas-microsoft-com:office:word" xmlns:w="http://schemas.openxmlformats.org/wordprocessingml/2006/main" xmlns:w14="http://schemas.microsoft.com/office/word/2010/wordml" xmlns:w15="http://schemas.microsoft.com/office/word/2012/wordml" xmlns:w16cex="http://schemas.microsoft.com/office/word/2018/wordml/cex" xmlns:w16cid="http://schemas.microsoft.com/office/word/2016/wordml/cid" xmlns:w16="http://schemas.microsoft.com/office/word/2018/wordml" xmlns:w16du="http://schemas.microsoft.com/office/word/2023/wordml/word16du" xmlns:w16sdtdh="http://schemas.microsoft.com/office/word/2020/wordml/sdtdatahash" xmlns:w16sdtfl="http://schemas.microsoft.com/office/word/2024/wordml/sdtformatlock" xmlns:w16se="http://schemas.microsoft.com/office/word/2015/wordml/symex" xmlns:wpg="http://schemas.microsoft.com/office/word/2010/wordprocessingGroup" xmlns:wpi="http://schemas.microsoft.com/office/word/2010/wordprocessingInk" xmlns:wne="http://schemas.microsoft.com/office/word/2006/wordml" xmlns:wps="http://schemas.microsoft.com/office/word/2010/wordprocessingShape" mc:Ignorable="w14 w15 w16se w16cid w16 w16cex w16sdtdh w16sdtfl w16du wp14">
   <w:body>
+    <w:p>
+      <w:pPr>
+        <w:rPr>
+          <w:b/>
+          <w:bCs/>
+        </w:rPr>
+      </w:pPr>
+    </w:p>
     <w:p>
       <w:pPr>
         <w:rPr>
@@ -98,13 +106,7 @@
         </w:numPr>
       </w:pPr>
       <w:r>
-        <w:t>Функционирование без динамического выделения</w:t>
-      </w:r>
-      <w:r>
-        <w:t>,</w:t>
-      </w:r>
-      <w:r>
-        <w:t xml:space="preserve"> </w:t>
+        <w:t xml:space="preserve">Функционирование без динамического выделения, </w:t>
       </w:r>
       <w:r>
         <w:t xml:space="preserve">в малом объёме </w:t>
@@ -113,13 +115,7 @@
         <w:t xml:space="preserve">статически выделенной </w:t>
       </w:r>
       <w:r>
-        <w:t>оперативной памяти 256-1024</w:t>
-      </w:r>
-      <w:r>
-        <w:t xml:space="preserve"> </w:t>
-      </w:r>
-      <w:r>
-        <w:t>байт</w:t>
+        <w:t>оперативной памяти 256-1024 байт</w:t>
       </w:r>
     </w:p>
     <w:p>
@@ -143,16 +139,7 @@
         <w:t>без случайного доступа на запись</w:t>
       </w:r>
       <w:r>
-        <w:t xml:space="preserve">. Требуется для записи </w:t>
-      </w:r>
-      <w:r>
-        <w:t>напрямую в флэш</w:t>
-      </w:r>
-      <w:r>
-        <w:t>-память без необходимости стирать страницы</w:t>
-      </w:r>
-      <w:r>
-        <w:t xml:space="preserve"> </w:t>
+        <w:t xml:space="preserve">. Требуется для записи напрямую в флэш-память без необходимости стирать страницы </w:t>
       </w:r>
       <w:r>
         <w:t xml:space="preserve">памяти </w:t>
@@ -164,10 +151,7 @@
         <w:t>обновлять</w:t>
       </w:r>
       <w:r>
-        <w:t xml:space="preserve"> файл</w:t>
-      </w:r>
-      <w:r>
-        <w:t xml:space="preserve"> встраиваемой ФС</w:t>
+        <w:t xml:space="preserve"> файл встраиваемой ФС</w:t>
       </w:r>
       <w:r>
         <w:t xml:space="preserve"> (</w:t>
@@ -212,15 +196,7 @@
         <w:t>структур</w:t>
       </w:r>
       <w:r>
-        <w:t xml:space="preserve"> (заголовок данных / таблицы </w:t>
-      </w:r>
-      <w:proofErr w:type="spellStart"/>
-      <w:r>
-        <w:t>бд</w:t>
-      </w:r>
-      <w:proofErr w:type="spellEnd"/>
-      <w:r>
-        <w:t>)</w:t>
+        <w:t xml:space="preserve"> (заголовок данных / таблицы бд)</w:t>
       </w:r>
       <w:r>
         <w:t xml:space="preserve"> </w:t>
@@ -235,15 +211,7 @@
         </w:numPr>
       </w:pPr>
       <w:r>
-        <w:t xml:space="preserve">Возможность записи нескольких экземпляров данных (строки в таблице </w:t>
-      </w:r>
-      <w:proofErr w:type="spellStart"/>
-      <w:r>
-        <w:t>бд</w:t>
-      </w:r>
-      <w:proofErr w:type="spellEnd"/>
-      <w:r>
-        <w:t>)</w:t>
+        <w:t>Возможность записи нескольких экземпляров данных (строки в таблице бд)</w:t>
       </w:r>
     </w:p>
     <w:p>
@@ -300,16 +268,7 @@
         </w:numPr>
       </w:pPr>
       <w:r>
-        <w:t>Бинарн</w:t>
-      </w:r>
-      <w:r>
-        <w:t>ая</w:t>
-      </w:r>
-      <w:r>
-        <w:t xml:space="preserve"> </w:t>
-      </w:r>
-      <w:r>
-        <w:t>запись</w:t>
+        <w:t>Бинарная запись</w:t>
       </w:r>
       <w:r>
         <w:t xml:space="preserve"> данных должна быть как можно более компактной</w:t>
@@ -329,11 +288,9 @@
           <w:numId w:val="1"/>
         </w:numPr>
       </w:pPr>
-      <w:proofErr w:type="spellStart"/>
       <w:r>
         <w:t>little-endian</w:t>
       </w:r>
-      <w:proofErr w:type="spellEnd"/>
     </w:p>
     <w:p>
       <w:pPr>
@@ -377,35 +334,180 @@
         </w:numPr>
       </w:pPr>
       <w:r>
-        <w:t>Контроль целостности (блочный, опционально)</w:t>
-      </w:r>
-      <w:r>
-        <w:t xml:space="preserve"> </w:t>
-      </w:r>
-      <w:r>
-        <w:t>–</w:t>
-      </w:r>
-      <w:r>
-        <w:t xml:space="preserve"> </w:t>
-      </w:r>
-      <w:r>
-        <w:rPr>
-          <w:lang w:val="en-US"/>
-        </w:rPr>
-        <w:t>CRC</w:t>
-      </w:r>
-      <w:r>
-        <w:t xml:space="preserve">16 </w:t>
-      </w:r>
-      <w:r>
-        <w:t>в конце каждого</w:t>
-      </w:r>
-      <w:r>
-        <w:t xml:space="preserve"> бинарного</w:t>
-      </w:r>
-      <w:r>
-        <w:t xml:space="preserve"> блока </w:t>
-      </w:r>
+        <w:t>Сжатие</w:t>
+      </w:r>
+      <w:r>
+        <w:t xml:space="preserve"> </w:t>
+      </w:r>
+      <w:r>
+        <w:t>целых</w:t>
+      </w:r>
+      <w:r>
+        <w:t xml:space="preserve"> </w:t>
+      </w:r>
+      <w:r>
+        <w:t>чисел</w:t>
+      </w:r>
+      <w:r>
+        <w:t xml:space="preserve"> </w:t>
+      </w:r>
+      <w:r>
+        <w:t xml:space="preserve">– </w:t>
+      </w:r>
+      <w:r>
+        <w:t>ещё</w:t>
+      </w:r>
+      <w:r>
+        <w:t xml:space="preserve"> </w:t>
+      </w:r>
+      <w:r>
+        <w:t>не</w:t>
+      </w:r>
+      <w:r>
+        <w:t xml:space="preserve"> </w:t>
+      </w:r>
+      <w:r>
+        <w:t>доделал, реализовано</w:t>
+      </w:r>
+      <w:r>
+        <w:t xml:space="preserve"> </w:t>
+      </w:r>
+      <w:r>
+        <w:t>только</w:t>
+      </w:r>
+      <w:r>
+        <w:t xml:space="preserve"> </w:t>
+      </w:r>
+      <w:r>
+        <w:t xml:space="preserve">в версии </w:t>
+      </w:r>
+      <w:r>
+        <w:rPr>
+          <w:lang w:val="en-US"/>
+        </w:rPr>
+        <w:t>C</w:t>
+      </w:r>
+      <w:r>
+        <w:t>#</w:t>
+      </w:r>
+      <w:r>
+        <w:t xml:space="preserve"> </w:t>
+      </w:r>
+    </w:p>
+    <w:p>
+      <w:pPr>
+        <w:pStyle w:val="a7"/>
+      </w:pPr>
+      <w:hyperlink r:id="rId5" w:history="1">
+        <w:r>
+          <w:rPr>
+            <w:rStyle w:val="ac"/>
+            <w:lang w:val="en-US"/>
+          </w:rPr>
+          <w:t>Variable</w:t>
+        </w:r>
+        <w:r>
+          <w:rPr>
+            <w:rStyle w:val="ac"/>
+          </w:rPr>
+          <w:t>-</w:t>
+        </w:r>
+        <w:r>
+          <w:rPr>
+            <w:rStyle w:val="ac"/>
+            <w:lang w:val="en-US"/>
+          </w:rPr>
+          <w:t>length</w:t>
+        </w:r>
+        <w:r>
+          <w:rPr>
+            <w:rStyle w:val="ac"/>
+          </w:rPr>
+          <w:t xml:space="preserve"> </w:t>
+        </w:r>
+        <w:r>
+          <w:rPr>
+            <w:rStyle w:val="ac"/>
+            <w:lang w:val="en-US"/>
+          </w:rPr>
+          <w:t>quantity</w:t>
+        </w:r>
+        <w:r>
+          <w:rPr>
+            <w:rStyle w:val="ac"/>
+          </w:rPr>
+          <w:t xml:space="preserve"> - </w:t>
+        </w:r>
+        <w:r>
+          <w:rPr>
+            <w:rStyle w:val="ac"/>
+            <w:lang w:val="en-US"/>
+          </w:rPr>
+          <w:t>Wikipedia</w:t>
+        </w:r>
+      </w:hyperlink>
+      <w:r>
+        <w:t xml:space="preserve"> ,  </w:t>
+      </w:r>
+      <w:hyperlink r:id="rId6" w:anchor="varints" w:history="1">
+        <w:r>
+          <w:rPr>
+            <w:rStyle w:val="ac"/>
+            <w:lang w:val="en-US"/>
+          </w:rPr>
+          <w:t>Encoding</w:t>
+        </w:r>
+        <w:r>
+          <w:rPr>
+            <w:rStyle w:val="ac"/>
+          </w:rPr>
+          <w:t xml:space="preserve"> | </w:t>
+        </w:r>
+        <w:r>
+          <w:rPr>
+            <w:rStyle w:val="ac"/>
+            <w:lang w:val="en-US"/>
+          </w:rPr>
+          <w:t>Protocol</w:t>
+        </w:r>
+        <w:r>
+          <w:rPr>
+            <w:rStyle w:val="ac"/>
+          </w:rPr>
+          <w:t xml:space="preserve"> </w:t>
+        </w:r>
+        <w:r>
+          <w:rPr>
+            <w:rStyle w:val="ac"/>
+            <w:lang w:val="en-US"/>
+          </w:rPr>
+          <w:t>Buffers</w:t>
+        </w:r>
+        <w:r>
+          <w:rPr>
+            <w:rStyle w:val="ac"/>
+          </w:rPr>
+          <w:t xml:space="preserve"> </w:t>
+        </w:r>
+        <w:r>
+          <w:rPr>
+            <w:rStyle w:val="ac"/>
+            <w:lang w:val="en-US"/>
+          </w:rPr>
+          <w:t>Documentation</w:t>
+        </w:r>
+      </w:hyperlink>
+      <w:r>
+        <w:t xml:space="preserve"> , </w:t>
+      </w:r>
+      <w:hyperlink r:id="rId7" w:history="1">
+        <w:r>
+          <w:rPr>
+            <w:rStyle w:val="ac"/>
+          </w:rPr>
+          <w:t>Compact varint — уникальность и большие значения за ту же стоимость / Хабр</w:t>
+        </w:r>
+      </w:hyperlink>
     </w:p>
     <w:p>
       <w:pPr>
@@ -416,219 +518,135 @@
         </w:numPr>
       </w:pPr>
       <w:r>
-        <w:t>Сжатие</w:t>
-      </w:r>
-      <w:r>
-        <w:t xml:space="preserve"> </w:t>
-      </w:r>
-      <w:r>
-        <w:t>целых</w:t>
-      </w:r>
-      <w:r>
-        <w:t xml:space="preserve"> </w:t>
-      </w:r>
-      <w:r>
-        <w:t>чисел</w:t>
-      </w:r>
-      <w:r>
-        <w:t xml:space="preserve"> </w:t>
-      </w:r>
-      <w:r>
-        <w:t xml:space="preserve">– </w:t>
-      </w:r>
-      <w:r>
-        <w:t>ещё</w:t>
-      </w:r>
-      <w:r>
-        <w:t xml:space="preserve"> </w:t>
-      </w:r>
-      <w:r>
-        <w:t>не</w:t>
-      </w:r>
-      <w:r>
-        <w:t xml:space="preserve"> </w:t>
-      </w:r>
-      <w:r>
-        <w:t>доделал, реализовано</w:t>
-      </w:r>
-      <w:r>
-        <w:t xml:space="preserve"> </w:t>
-      </w:r>
-      <w:r>
-        <w:t>только</w:t>
-      </w:r>
-      <w:r>
-        <w:t xml:space="preserve"> </w:t>
-      </w:r>
-      <w:r>
-        <w:t xml:space="preserve">в </w:t>
-      </w:r>
-      <w:r>
-        <w:t xml:space="preserve">версии </w:t>
-      </w:r>
-      <w:r>
-        <w:rPr>
-          <w:lang w:val="en-US"/>
-        </w:rPr>
-        <w:t>C</w:t>
-      </w:r>
-      <w:r>
-        <w:t>#</w:t>
-      </w:r>
-      <w:r>
-        <w:t xml:space="preserve"> </w:t>
-      </w:r>
-    </w:p>
-    <w:p>
-      <w:pPr>
-        <w:pStyle w:val="a7"/>
-      </w:pPr>
-      <w:hyperlink r:id="rId5" w:history="1">
-        <w:r>
-          <w:rPr>
-            <w:rStyle w:val="ac"/>
-            <w:lang w:val="en-US"/>
-          </w:rPr>
-          <w:t>Variable</w:t>
-        </w:r>
-        <w:r>
-          <w:rPr>
-            <w:rStyle w:val="ac"/>
-          </w:rPr>
-          <w:t>-</w:t>
-        </w:r>
-        <w:r>
-          <w:rPr>
-            <w:rStyle w:val="ac"/>
-            <w:lang w:val="en-US"/>
-          </w:rPr>
-          <w:t>length</w:t>
-        </w:r>
-        <w:r>
-          <w:rPr>
-            <w:rStyle w:val="ac"/>
-          </w:rPr>
-          <w:t xml:space="preserve"> </w:t>
-        </w:r>
-        <w:r>
-          <w:rPr>
-            <w:rStyle w:val="ac"/>
-            <w:lang w:val="en-US"/>
-          </w:rPr>
-          <w:t>qu</w:t>
-        </w:r>
-        <w:r>
-          <w:rPr>
-            <w:rStyle w:val="ac"/>
-            <w:lang w:val="en-US"/>
-          </w:rPr>
-          <w:t>a</w:t>
-        </w:r>
-        <w:r>
-          <w:rPr>
-            <w:rStyle w:val="ac"/>
-            <w:lang w:val="en-US"/>
-          </w:rPr>
-          <w:t>ntity</w:t>
-        </w:r>
-        <w:r>
-          <w:rPr>
-            <w:rStyle w:val="ac"/>
-          </w:rPr>
-          <w:t xml:space="preserve"> - </w:t>
-        </w:r>
-        <w:r>
-          <w:rPr>
-            <w:rStyle w:val="ac"/>
-            <w:lang w:val="en-US"/>
-          </w:rPr>
-          <w:t>Wikipedia</w:t>
-        </w:r>
-      </w:hyperlink>
-      <w:r>
-        <w:t xml:space="preserve"> ,  </w:t>
-      </w:r>
-      <w:hyperlink r:id="rId6" w:anchor="varints" w:history="1">
-        <w:r>
-          <w:rPr>
-            <w:rStyle w:val="ac"/>
-            <w:lang w:val="en-US"/>
-          </w:rPr>
-          <w:t>Encoding</w:t>
-        </w:r>
-        <w:r>
-          <w:rPr>
-            <w:rStyle w:val="ac"/>
-          </w:rPr>
-          <w:t xml:space="preserve"> | </w:t>
-        </w:r>
-        <w:r>
-          <w:rPr>
-            <w:rStyle w:val="ac"/>
-            <w:lang w:val="en-US"/>
-          </w:rPr>
-          <w:t>Protocol</w:t>
-        </w:r>
-        <w:r>
-          <w:rPr>
-            <w:rStyle w:val="ac"/>
-          </w:rPr>
-          <w:t xml:space="preserve"> </w:t>
-        </w:r>
-        <w:r>
-          <w:rPr>
-            <w:rStyle w:val="ac"/>
-            <w:lang w:val="en-US"/>
-          </w:rPr>
-          <w:t>Buffers</w:t>
-        </w:r>
-        <w:r>
-          <w:rPr>
-            <w:rStyle w:val="ac"/>
-          </w:rPr>
-          <w:t xml:space="preserve"> </w:t>
-        </w:r>
-        <w:r>
-          <w:rPr>
-            <w:rStyle w:val="ac"/>
-            <w:lang w:val="en-US"/>
-          </w:rPr>
-          <w:t>Documentation</w:t>
-        </w:r>
-      </w:hyperlink>
-      <w:r>
-        <w:t xml:space="preserve"> , </w:t>
-      </w:r>
-      <w:hyperlink r:id="rId7" w:history="1">
-        <w:r>
-          <w:rPr>
-            <w:rStyle w:val="ac"/>
-          </w:rPr>
-          <w:t xml:space="preserve">Compact </w:t>
-        </w:r>
-        <w:proofErr w:type="spellStart"/>
-        <w:r>
-          <w:rPr>
-            <w:rStyle w:val="ac"/>
-          </w:rPr>
-          <w:t>varint</w:t>
-        </w:r>
-        <w:proofErr w:type="spellEnd"/>
-        <w:r>
-          <w:rPr>
-            <w:rStyle w:val="ac"/>
-          </w:rPr>
-          <w:t xml:space="preserve"> — уникальность и большие значения за ту же стоимость / </w:t>
-        </w:r>
-        <w:proofErr w:type="spellStart"/>
-        <w:r>
-          <w:rPr>
-            <w:rStyle w:val="ac"/>
-          </w:rPr>
-          <w:t>Хабр</w:t>
-        </w:r>
-        <w:proofErr w:type="spellEnd"/>
-      </w:hyperlink>
+        <w:t>Разностное</w:t>
+      </w:r>
+      <w:r>
+        <w:t xml:space="preserve"> </w:t>
+      </w:r>
+      <w:r>
+        <w:t>сжатие</w:t>
+      </w:r>
+      <w:r>
+        <w:t xml:space="preserve"> – сжатие </w:t>
+      </w:r>
+      <w:r>
+        <w:t>данных,</w:t>
+      </w:r>
+      <w:r>
+        <w:t xml:space="preserve"> которые мало отличаются между измерениями</w:t>
+      </w:r>
+      <w:r>
+        <w:t xml:space="preserve"> + </w:t>
+      </w:r>
+      <w:r>
+        <w:t>Variable-length</w:t>
+      </w:r>
+      <w:r>
+        <w:t xml:space="preserve">, например </w:t>
+      </w:r>
+      <w:r>
+        <w:t>время</w:t>
+      </w:r>
+      <w:r>
+        <w:t xml:space="preserve"> </w:t>
+      </w:r>
+      <w:r>
+        <w:t>UNIX (</w:t>
+      </w:r>
+      <w:r>
+        <w:rPr>
+          <w:lang w:val="en-US"/>
+        </w:rPr>
+        <w:t>int</w:t>
+      </w:r>
+      <w:r>
+        <w:t xml:space="preserve">64 </w:t>
+      </w:r>
+      <w:r>
+        <w:t>в секундах</w:t>
+      </w:r>
+      <w:r>
+        <w:t xml:space="preserve"> </w:t>
+      </w:r>
+      <w:r>
+        <w:rPr>
+          <w:lang w:val="en-US"/>
+        </w:rPr>
+        <w:t>c</w:t>
+      </w:r>
+      <w:r>
+        <w:t xml:space="preserve"> 1970)</w:t>
+      </w:r>
+      <w:r>
+        <w:t xml:space="preserve">, </w:t>
+      </w:r>
+      <w:r>
+        <w:t xml:space="preserve">время </w:t>
+      </w:r>
+      <w:r>
+        <w:t>1757582277</w:t>
+      </w:r>
+      <w:r>
+        <w:t>(8 байт)</w:t>
+      </w:r>
+      <w:r>
+        <w:t xml:space="preserve">, </w:t>
+      </w:r>
+      <w:r>
+        <w:t>175758227</w:t>
+      </w:r>
+      <w:r>
+        <w:t>8</w:t>
+      </w:r>
+      <w:r>
+        <w:t xml:space="preserve">(8 байт) </w:t>
+      </w:r>
+      <w:r>
+        <w:t>– 16 байт заменять на</w:t>
+      </w:r>
+      <w:r>
+        <w:t>:</w:t>
+      </w:r>
+      <w:r>
+        <w:t xml:space="preserve"> </w:t>
+      </w:r>
+      <w:r>
+        <w:t>1757582277</w:t>
+      </w:r>
+      <w:r>
+        <w:t>(8 байт)</w:t>
+      </w:r>
+      <w:r>
+        <w:t>, +1</w:t>
+      </w:r>
+      <w:r>
+        <w:t>(1 байт)</w:t>
+      </w:r>
+      <w:r>
+        <w:t xml:space="preserve"> </w:t>
+      </w:r>
+      <w:r>
+        <w:t xml:space="preserve">– 9 байт </w:t>
+      </w:r>
+      <w:r>
+        <w:t xml:space="preserve"> </w:t>
+      </w:r>
+    </w:p>
+    <w:p>
+      <w:pPr>
+        <w:rPr>
+          <w:b/>
+          <w:bCs/>
+        </w:rPr>
+      </w:pPr>
+      <w:r>
+        <w:rPr>
+          <w:b/>
+          <w:bCs/>
+          <w:highlight w:val="yellow"/>
+        </w:rPr>
+        <w:t>Недостатки</w:t>
+      </w:r>
     </w:p>
     <w:p>
       <w:pPr>
@@ -639,144 +657,10 @@
         </w:numPr>
       </w:pPr>
       <w:r>
-        <w:t>Разностное</w:t>
-      </w:r>
-      <w:r>
-        <w:t xml:space="preserve"> </w:t>
-      </w:r>
-      <w:r>
-        <w:t>сжатие</w:t>
-      </w:r>
-      <w:r>
-        <w:t xml:space="preserve"> – сжатие </w:t>
-      </w:r>
-      <w:r>
-        <w:t>данных,</w:t>
-      </w:r>
-      <w:r>
-        <w:t xml:space="preserve"> которые мало отличаются между измерениями</w:t>
-      </w:r>
-      <w:r>
-        <w:t xml:space="preserve"> + </w:t>
-      </w:r>
-      <w:proofErr w:type="spellStart"/>
-      <w:r>
-        <w:t>Variable-length</w:t>
-      </w:r>
-      <w:proofErr w:type="spellEnd"/>
-      <w:r>
-        <w:t xml:space="preserve">, например </w:t>
-      </w:r>
-      <w:r>
-        <w:t>время</w:t>
-      </w:r>
-      <w:r>
-        <w:t xml:space="preserve"> </w:t>
-      </w:r>
-      <w:r>
-        <w:t xml:space="preserve">UNIX </w:t>
-      </w:r>
-      <w:r>
-        <w:t>(</w:t>
-      </w:r>
-      <w:r>
-        <w:rPr>
-          <w:lang w:val="en-US"/>
-        </w:rPr>
-        <w:t>int</w:t>
-      </w:r>
-      <w:r>
-        <w:t xml:space="preserve">64 </w:t>
-      </w:r>
-      <w:r>
-        <w:t>в секундах</w:t>
-      </w:r>
-      <w:r>
-        <w:t xml:space="preserve"> </w:t>
-      </w:r>
-      <w:r>
-        <w:rPr>
-          <w:lang w:val="en-US"/>
-        </w:rPr>
-        <w:t>c</w:t>
-      </w:r>
-      <w:r>
-        <w:t xml:space="preserve"> 1970)</w:t>
-      </w:r>
-      <w:r>
-        <w:t xml:space="preserve">, </w:t>
-      </w:r>
-      <w:r>
-        <w:t>время</w:t>
-      </w:r>
-      <w:r>
-        <w:t xml:space="preserve"> </w:t>
-      </w:r>
-      <w:r>
-        <w:t>1757582277</w:t>
-      </w:r>
-      <w:r>
-        <w:t>(</w:t>
-      </w:r>
-      <w:r>
-        <w:t>8 байт</w:t>
-      </w:r>
-      <w:r>
-        <w:t>)</w:t>
-      </w:r>
-      <w:r>
-        <w:t xml:space="preserve">, </w:t>
-      </w:r>
-      <w:r>
-        <w:t>175758227</w:t>
-      </w:r>
-      <w:r>
-        <w:t>8</w:t>
-      </w:r>
-      <w:r>
-        <w:t>(</w:t>
-      </w:r>
-      <w:r>
-        <w:t>8 байт</w:t>
-      </w:r>
-      <w:r>
-        <w:t xml:space="preserve">) </w:t>
-      </w:r>
-      <w:r>
-        <w:t>– 16 байт заменять на</w:t>
-      </w:r>
-      <w:r>
-        <w:t>:</w:t>
-      </w:r>
-      <w:r>
-        <w:t xml:space="preserve"> </w:t>
-      </w:r>
-      <w:r>
-        <w:t>1757582277</w:t>
-      </w:r>
-      <w:r>
-        <w:t>(8 байт)</w:t>
-      </w:r>
-      <w:r>
-        <w:t>, +1</w:t>
-      </w:r>
-      <w:r>
-        <w:t>(</w:t>
-      </w:r>
-      <w:r>
-        <w:t>1</w:t>
-      </w:r>
-      <w:r>
-        <w:t xml:space="preserve"> байт)</w:t>
-      </w:r>
-      <w:r>
-        <w:t xml:space="preserve"> </w:t>
-      </w:r>
-      <w:r>
-        <w:t xml:space="preserve">– 9 байт </w:t>
-      </w:r>
-      <w:r>
-        <w:t xml:space="preserve"> </w:t>
+        <w:t>нужно или грузить в память целиком, или обрабатывать в несколько проходов, если он не влезает в память. Также, если нужна не вся информация из файла — все равно придется прочитать его весь</w:t>
+      </w:r>
+      <w:r>
+        <w:t xml:space="preserve"> или создавать индексы (ссылки на данные) отдельным файлом</w:t>
       </w:r>
     </w:p>
     <w:p>
@@ -790,166 +674,122 @@
         <w:rPr>
           <w:b/>
           <w:bCs/>
-          <w:highlight w:val="yellow"/>
-        </w:rPr>
-        <w:t>Недостатки</w:t>
-      </w:r>
-    </w:p>
-    <w:p>
-      <w:pPr>
-        <w:pStyle w:val="a7"/>
-        <w:numPr>
-          <w:ilvl w:val="0"/>
-          <w:numId w:val="1"/>
-        </w:numPr>
-      </w:pPr>
-      <w:r>
-        <w:t>нужно или грузить в память целиком, или обрабатывать в несколько проходов, если он не влезает в память. Также, если нужна не вся информация из файла — все равно придется прочитать его весь</w:t>
-      </w:r>
-      <w:r>
-        <w:t xml:space="preserve"> или создавать индексы (ссылки на данные) отдельным файлом</w:t>
-      </w:r>
-    </w:p>
-    <w:p>
-      <w:pPr>
+        </w:rPr>
+        <w:t xml:space="preserve">использование конвертера </w:t>
+      </w:r>
+      <w:r>
         <w:rPr>
           <w:b/>
           <w:bCs/>
           <w:lang w:val="en-US"/>
         </w:rPr>
-      </w:pPr>
-      <w:proofErr w:type="spellStart"/>
+        <w:t>edf</w:t>
+      </w:r>
       <w:r>
         <w:rPr>
           <w:b/>
           <w:bCs/>
-          <w:lang w:val="en-US"/>
-        </w:rPr>
-        <w:t>использование</w:t>
-      </w:r>
-      <w:proofErr w:type="spellEnd"/>
+        </w:rPr>
+        <w:t>.</w:t>
+      </w:r>
       <w:r>
         <w:rPr>
           <w:b/>
           <w:bCs/>
           <w:lang w:val="en-US"/>
         </w:rPr>
-        <w:t xml:space="preserve"> </w:t>
-      </w:r>
-      <w:proofErr w:type="spellStart"/>
+        <w:t>exe</w:t>
+      </w:r>
+    </w:p>
+    <w:p>
+      <w:r>
+        <w:rPr>
+          <w:lang w:val="en-US"/>
+        </w:rPr>
+        <w:t>edf</w:t>
+      </w:r>
+      <w:r>
+        <w:t>.</w:t>
+      </w:r>
+      <w:r>
+        <w:rPr>
+          <w:lang w:val="en-US"/>
+        </w:rPr>
+        <w:t>exe</w:t>
+      </w:r>
+      <w:r>
+        <w:t xml:space="preserve"> 1</w:t>
+      </w:r>
+      <w:r>
+        <w:rPr>
+          <w:lang w:val="en-US"/>
+        </w:rPr>
+        <w:t>D</w:t>
+      </w:r>
+      <w:r>
+        <w:t>.</w:t>
+      </w:r>
+      <w:r>
+        <w:rPr>
+          <w:lang w:val="en-US"/>
+        </w:rPr>
+        <w:t>D</w:t>
+      </w:r>
+      <w:r>
+        <w:t xml:space="preserve"> </w:t>
+      </w:r>
+      <w:r>
+        <w:rPr>
+          <w:lang w:val="en-US"/>
+        </w:rPr>
+        <w:t>t</w:t>
+      </w:r>
+      <w:r>
+        <w:t xml:space="preserve"> – </w:t>
+      </w:r>
+      <w:r>
+        <w:t>конвертер</w:t>
+      </w:r>
+      <w:r>
+        <w:t xml:space="preserve"> </w:t>
+      </w:r>
+      <w:r>
+        <w:t>динамограммы</w:t>
+      </w:r>
+      <w:r>
+        <w:t xml:space="preserve"> </w:t>
+      </w:r>
+      <w:r>
+        <w:t>в</w:t>
+      </w:r>
+      <w:r>
+        <w:t xml:space="preserve"> </w:t>
+      </w:r>
       <w:r>
         <w:rPr>
           <w:b/>
           <w:bCs/>
-          <w:lang w:val="en-US"/>
-        </w:rPr>
-        <w:t>конвертера</w:t>
-      </w:r>
-      <w:proofErr w:type="spellEnd"/>
-      <w:r>
-        <w:rPr>
-          <w:b/>
-          <w:bCs/>
-          <w:lang w:val="en-US"/>
-        </w:rPr>
-        <w:t xml:space="preserve"> edf.exe</w:t>
-      </w:r>
-    </w:p>
-    <w:p>
-      <w:proofErr w:type="spellStart"/>
-      <w:r>
-        <w:rPr>
-          <w:lang w:val="en-US"/>
-        </w:rPr>
-        <w:t>edf</w:t>
-      </w:r>
-      <w:proofErr w:type="spellEnd"/>
+        </w:rPr>
+        <w:t>текстовый</w:t>
+      </w:r>
+      <w:r>
+        <w:t xml:space="preserve"> </w:t>
+      </w:r>
+      <w:r>
+        <w:t>вариант</w:t>
+      </w:r>
+      <w:r>
+        <w:t xml:space="preserve"> 1</w:t>
+      </w:r>
+      <w:r>
+        <w:rPr>
+          <w:lang w:val="en-US"/>
+        </w:rPr>
+        <w:t>D</w:t>
+      </w:r>
       <w:r>
         <w:t>.</w:t>
       </w:r>
-      <w:r>
-        <w:rPr>
-          <w:lang w:val="en-US"/>
-        </w:rPr>
-        <w:t>exe</w:t>
-      </w:r>
-      <w:r>
-        <w:t xml:space="preserve"> 1</w:t>
-      </w:r>
-      <w:r>
-        <w:rPr>
-          <w:lang w:val="en-US"/>
-        </w:rPr>
-        <w:t>D</w:t>
-      </w:r>
-      <w:r>
-        <w:t>.</w:t>
-      </w:r>
-      <w:r>
-        <w:rPr>
-          <w:lang w:val="en-US"/>
-        </w:rPr>
-        <w:t>D</w:t>
-      </w:r>
-      <w:r>
-        <w:t xml:space="preserve"> </w:t>
-      </w:r>
-      <w:r>
-        <w:rPr>
-          <w:lang w:val="en-US"/>
-        </w:rPr>
-        <w:t>t</w:t>
-      </w:r>
-      <w:r>
-        <w:t xml:space="preserve"> – </w:t>
-      </w:r>
-      <w:r>
-        <w:t>конвертер</w:t>
-      </w:r>
-      <w:r>
-        <w:t xml:space="preserve"> </w:t>
-      </w:r>
-      <w:r>
-        <w:t>динамограммы</w:t>
-      </w:r>
-      <w:r>
-        <w:t xml:space="preserve"> </w:t>
-      </w:r>
-      <w:r>
-        <w:t>в</w:t>
-      </w:r>
-      <w:r>
-        <w:t xml:space="preserve"> </w:t>
-      </w:r>
-      <w:r>
-        <w:rPr>
-          <w:b/>
-          <w:bCs/>
-        </w:rPr>
-        <w:t>текстовый</w:t>
-      </w:r>
-      <w:r>
-        <w:t xml:space="preserve"> </w:t>
-      </w:r>
-      <w:r>
-        <w:t>вариант</w:t>
-      </w:r>
-      <w:r>
-        <w:t xml:space="preserve"> </w:t>
-      </w:r>
-      <w:r>
-        <w:t>1</w:t>
-      </w:r>
-      <w:r>
-        <w:rPr>
-          <w:lang w:val="en-US"/>
-        </w:rPr>
-        <w:t>D</w:t>
-      </w:r>
-      <w:r>
-        <w:t>.</w:t>
-      </w:r>
-      <w:proofErr w:type="spellStart"/>
       <w:r>
         <w:rPr>
           <w:b/>
@@ -965,17 +805,14 @@
         </w:rPr>
         <w:t>df</w:t>
       </w:r>
-      <w:proofErr w:type="spellEnd"/>
-    </w:p>
-    <w:p>
-      <w:proofErr w:type="spellStart"/>
+    </w:p>
+    <w:p>
       <w:r>
         <w:rPr>
           <w:lang w:val="en-US"/>
         </w:rPr>
         <w:t>edf</w:t>
       </w:r>
-      <w:proofErr w:type="spellEnd"/>
       <w:r>
         <w:t>.</w:t>
       </w:r>
@@ -1061,7 +898,6 @@
       <w:r>
         <w:t>.</w:t>
       </w:r>
-      <w:proofErr w:type="spellStart"/>
       <w:r>
         <w:rPr>
           <w:b/>
@@ -1077,17 +913,14 @@
         </w:rPr>
         <w:t>df</w:t>
       </w:r>
-      <w:proofErr w:type="spellEnd"/>
-    </w:p>
-    <w:p>
-      <w:proofErr w:type="spellStart"/>
+    </w:p>
+    <w:p>
       <w:r>
         <w:rPr>
           <w:lang w:val="en-US"/>
         </w:rPr>
         <w:t>edf</w:t>
       </w:r>
-      <w:proofErr w:type="spellEnd"/>
       <w:r>
         <w:t>.</w:t>
       </w:r>
@@ -1125,10 +958,7 @@
         <w:t>t</w:t>
       </w:r>
       <w:r>
-        <w:t xml:space="preserve"> </w:t>
-      </w:r>
-      <w:r>
-        <w:t xml:space="preserve">– </w:t>
+        <w:t xml:space="preserve"> – </w:t>
       </w:r>
       <w:r>
         <w:t>конвертер</w:t>
@@ -1137,10 +967,7 @@
         <w:t xml:space="preserve"> </w:t>
       </w:r>
       <w:r>
-        <w:t xml:space="preserve">данных </w:t>
-      </w:r>
-      <w:r>
-        <w:t>манометра (в т.ч. погружного)</w:t>
+        <w:t>данных манометра (в т.ч. погружного)</w:t>
       </w:r>
       <w:r>
         <w:t xml:space="preserve"> </w:t>
@@ -1176,7 +1003,6 @@
       <w:r>
         <w:t>.</w:t>
       </w:r>
-      <w:proofErr w:type="spellStart"/>
       <w:r>
         <w:rPr>
           <w:b/>
@@ -1192,17 +1018,14 @@
         </w:rPr>
         <w:t>df</w:t>
       </w:r>
-      <w:proofErr w:type="spellEnd"/>
-    </w:p>
-    <w:p>
-      <w:proofErr w:type="spellStart"/>
+    </w:p>
+    <w:p>
       <w:r>
         <w:rPr>
           <w:lang w:val="en-US"/>
         </w:rPr>
         <w:t>edf</w:t>
       </w:r>
-      <w:proofErr w:type="spellEnd"/>
       <w:r>
         <w:t>.</w:t>
       </w:r>
@@ -1288,7 +1111,6 @@
       <w:r>
         <w:t>.</w:t>
       </w:r>
-      <w:proofErr w:type="spellStart"/>
       <w:r>
         <w:rPr>
           <w:b/>
@@ -1304,17 +1126,14 @@
         </w:rPr>
         <w:t>df</w:t>
       </w:r>
-      <w:proofErr w:type="spellEnd"/>
-    </w:p>
-    <w:p>
-      <w:proofErr w:type="spellStart"/>
+    </w:p>
+    <w:p>
       <w:r>
         <w:rPr>
           <w:lang w:val="en-US"/>
         </w:rPr>
         <w:t>edf</w:t>
       </w:r>
-      <w:proofErr w:type="spellEnd"/>
       <w:r>
         <w:t>.</w:t>
       </w:r>
@@ -1400,7 +1219,6 @@
       <w:r>
         <w:t>.</w:t>
       </w:r>
-      <w:proofErr w:type="spellStart"/>
       <w:r>
         <w:rPr>
           <w:b/>
@@ -1416,17 +1234,14 @@
         </w:rPr>
         <w:t>df</w:t>
       </w:r>
-      <w:proofErr w:type="spellEnd"/>
-    </w:p>
-    <w:p>
-      <w:proofErr w:type="spellStart"/>
+    </w:p>
+    <w:p>
       <w:r>
         <w:rPr>
           <w:lang w:val="en-US"/>
         </w:rPr>
         <w:t>edf</w:t>
       </w:r>
-      <w:proofErr w:type="spellEnd"/>
       <w:r>
         <w:t>.</w:t>
       </w:r>
@@ -1467,10 +1282,7 @@
         <w:t xml:space="preserve"> </w:t>
       </w:r>
       <w:r>
-        <w:t>–</w:t>
-      </w:r>
-      <w:r>
-        <w:t xml:space="preserve"> </w:t>
+        <w:t xml:space="preserve">– </w:t>
       </w:r>
       <w:r>
         <w:t>конвертер</w:t>
@@ -1479,10 +1291,7 @@
         <w:t xml:space="preserve"> </w:t>
       </w:r>
       <w:r>
-        <w:t xml:space="preserve">данных </w:t>
-      </w:r>
-      <w:r>
-        <w:t>манометра (в т.ч. погружного)</w:t>
+        <w:t>данных манометра (в т.ч. погружного)</w:t>
       </w:r>
       <w:r>
         <w:t xml:space="preserve"> </w:t>
@@ -1518,7 +1327,6 @@
       <w:r>
         <w:t>.</w:t>
       </w:r>
-      <w:proofErr w:type="spellStart"/>
       <w:r>
         <w:rPr>
           <w:b/>
@@ -1534,20 +1342,17 @@
         </w:rPr>
         <w:t>df</w:t>
       </w:r>
-      <w:proofErr w:type="spellEnd"/>
-    </w:p>
-    <w:p>
-      <w:r>
-        <w:t xml:space="preserve"> </w:t>
-      </w:r>
-      <w:proofErr w:type="spellStart"/>
+    </w:p>
+    <w:p>
+      <w:r>
+        <w:t xml:space="preserve"> </w:t>
+      </w:r>
       <w:r>
         <w:rPr>
           <w:lang w:val="en-US"/>
         </w:rPr>
         <w:t>edf</w:t>
       </w:r>
-      <w:proofErr w:type="spellEnd"/>
       <w:r>
         <w:t>.</w:t>
       </w:r>
@@ -1569,14 +1374,12 @@
       <w:r>
         <w:t>.</w:t>
       </w:r>
-      <w:proofErr w:type="spellStart"/>
       <w:r>
         <w:rPr>
           <w:lang w:val="en-US"/>
         </w:rPr>
         <w:t>bdf</w:t>
       </w:r>
-      <w:proofErr w:type="spellEnd"/>
       <w:r>
         <w:t xml:space="preserve"> </w:t>
       </w:r>
@@ -1624,14 +1427,12 @@
       </w:r>
     </w:p>
     <w:p>
-      <w:proofErr w:type="spellStart"/>
       <w:r>
         <w:rPr>
           <w:lang w:val="en-US"/>
         </w:rPr>
         <w:t>edf</w:t>
       </w:r>
-      <w:proofErr w:type="spellEnd"/>
       <w:r>
         <w:t>.</w:t>
       </w:r>
@@ -1653,14 +1454,12 @@
       <w:r>
         <w:t>.</w:t>
       </w:r>
-      <w:proofErr w:type="spellStart"/>
       <w:r>
         <w:rPr>
           <w:lang w:val="en-US"/>
         </w:rPr>
         <w:t>bdf</w:t>
       </w:r>
-      <w:proofErr w:type="spellEnd"/>
       <w:r>
         <w:t xml:space="preserve"> </w:t>
       </w:r>
@@ -1713,17 +1512,14 @@
           <w:b/>
           <w:bCs/>
           <w:u w:val="single"/>
-          <w:lang w:val="en-US"/>
-        </w:rPr>
-      </w:pPr>
-      <w:proofErr w:type="spellStart"/>
+        </w:rPr>
+      </w:pPr>
       <w:r>
         <w:rPr>
           <w:lang w:val="en-US"/>
         </w:rPr>
         <w:t>edf</w:t>
       </w:r>
-      <w:proofErr w:type="spellEnd"/>
       <w:r>
         <w:t>.</w:t>
       </w:r>
@@ -1745,25 +1541,21 @@
       <w:r>
         <w:t>.</w:t>
       </w:r>
-      <w:proofErr w:type="spellStart"/>
       <w:r>
         <w:rPr>
           <w:lang w:val="en-US"/>
         </w:rPr>
         <w:t>bdf</w:t>
       </w:r>
-      <w:proofErr w:type="spellEnd"/>
-      <w:r>
-        <w:t xml:space="preserve"> </w:t>
-      </w:r>
-      <w:proofErr w:type="spellStart"/>
+      <w:r>
+        <w:t xml:space="preserve"> </w:t>
+      </w:r>
       <w:r>
         <w:rPr>
           <w:lang w:val="en-US"/>
         </w:rPr>
         <w:t>dat</w:t>
       </w:r>
-      <w:proofErr w:type="spellEnd"/>
       <w:r>
         <w:t xml:space="preserve"> </w:t>
       </w:r>
@@ -1777,16 +1569,7 @@
         <w:t xml:space="preserve"> </w:t>
       </w:r>
       <w:r>
-        <w:t xml:space="preserve">бинарного в </w:t>
-      </w:r>
-      <w:r>
-        <w:t>данны</w:t>
-      </w:r>
-      <w:r>
-        <w:t>е</w:t>
-      </w:r>
-      <w:r>
-        <w:t xml:space="preserve"> манометра</w:t>
+        <w:t>бинарного в данные манометра</w:t>
       </w:r>
       <w:r>
         <w:t xml:space="preserve"> 1</w:t>
@@ -1829,14 +1612,12 @@
       </w:r>
     </w:p>
     <w:p>
-      <w:proofErr w:type="spellStart"/>
       <w:r>
         <w:rPr>
           <w:lang w:val="en-US"/>
         </w:rPr>
         <w:t>dynChart</w:t>
       </w:r>
-      <w:proofErr w:type="spellEnd"/>
       <w:r>
         <w:t>.</w:t>
       </w:r>
@@ -1849,14 +1630,12 @@
       <w:r>
         <w:t xml:space="preserve">, </w:t>
       </w:r>
-      <w:proofErr w:type="spellStart"/>
       <w:r>
         <w:rPr>
           <w:lang w:val="en-US"/>
         </w:rPr>
         <w:t>echoChart</w:t>
       </w:r>
-      <w:proofErr w:type="spellEnd"/>
       <w:r>
         <w:t>.</w:t>
       </w:r>
@@ -1871,30 +1650,21 @@
       </w:r>
     </w:p>
     <w:p>
-      <w:pPr>
-        <w:rPr>
-          <w:lang w:val="en-US"/>
-        </w:rPr>
-      </w:pPr>
-      <w:proofErr w:type="spellStart"/>
       <w:r>
         <w:rPr>
           <w:lang w:val="en-US"/>
         </w:rPr>
         <w:t>npp</w:t>
       </w:r>
-      <w:proofErr w:type="spellEnd"/>
       <w:r>
         <w:t>_</w:t>
       </w:r>
-      <w:proofErr w:type="spellStart"/>
       <w:r>
         <w:rPr>
           <w:lang w:val="en-US"/>
         </w:rPr>
         <w:t>userDefineLang</w:t>
       </w:r>
-      <w:proofErr w:type="spellEnd"/>
       <w:r>
         <w:t>.</w:t>
       </w:r>
@@ -1905,10 +1675,7 @@
         <w:t>xml</w:t>
       </w:r>
       <w:r>
-        <w:t xml:space="preserve"> – </w:t>
-      </w:r>
-      <w:r>
-        <w:t>ра</w:t>
+        <w:t xml:space="preserve"> – ра</w:t>
       </w:r>
       <w:r>
         <w:t>скраска</w:t>
@@ -1948,14 +1715,12 @@
       <w:r>
         <w:t>.</w:t>
       </w:r>
-      <w:proofErr w:type="spellStart"/>
       <w:r>
         <w:rPr>
           <w:lang w:val="en-US"/>
         </w:rPr>
         <w:t>tdf</w:t>
       </w:r>
-      <w:proofErr w:type="spellEnd"/>
       <w:r>
         <w:t xml:space="preserve"> – </w:t>
       </w:r>
@@ -1969,7 +1734,6 @@
         <w:rPr>
           <w:b/>
           <w:bCs/>
-          <w:lang w:val="en-US"/>
         </w:rPr>
       </w:pPr>
       <w:r>
@@ -2004,21 +1768,7 @@
           <w:rStyle w:val="ac"/>
           <w:lang w:val="en-US"/>
         </w:rPr>
-        <w:t>Comparison of data-serialization formats - Wikipe</w:t>
-      </w:r>
-      <w:r>
-        <w:rPr>
-          <w:rStyle w:val="ac"/>
-          <w:lang w:val="en-US"/>
-        </w:rPr>
-        <w:t>d</w:t>
-      </w:r>
-      <w:r>
-        <w:rPr>
-          <w:rStyle w:val="ac"/>
-          <w:lang w:val="en-US"/>
-        </w:rPr>
-        <w:t>ia</w:t>
+        <w:t>Comparison of data-serialization formats - Wikipedia</w:t>
       </w:r>
       <w:r>
         <w:fldChar w:fldCharType="end"/>
@@ -2063,37 +1813,60 @@
         </w:rPr>
       </w:pPr>
       <w:hyperlink r:id="rId10" w:history="1">
-        <w:proofErr w:type="spellStart"/>
         <w:r>
           <w:rPr>
             <w:rStyle w:val="ac"/>
             <w:lang w:val="en-US"/>
           </w:rPr>
-          <w:t>protocolbuffers</w:t>
-        </w:r>
-        <w:proofErr w:type="spellEnd"/>
+          <w:t>protocolbuffers/protobuf: Protocol Buffers - Google's data interchange format</w:t>
+        </w:r>
+      </w:hyperlink>
+    </w:p>
+    <w:p>
+      <w:pPr>
+        <w:rPr>
+          <w:lang w:val="en-US"/>
+        </w:rPr>
+      </w:pPr>
+      <w:hyperlink r:id="rId11" w:history="1">
         <w:r>
           <w:rPr>
             <w:rStyle w:val="ac"/>
             <w:lang w:val="en-US"/>
           </w:rPr>
-          <w:t>/</w:t>
-        </w:r>
-        <w:proofErr w:type="spellStart"/>
+          <w:t>FlatBuffers Docs</w:t>
+        </w:r>
+      </w:hyperlink>
+    </w:p>
+    <w:p>
+      <w:pPr>
+        <w:rPr>
+          <w:lang w:val="en-US"/>
+        </w:rPr>
+      </w:pPr>
+      <w:hyperlink r:id="rId12" w:history="1">
         <w:r>
           <w:rPr>
             <w:rStyle w:val="ac"/>
             <w:lang w:val="en-US"/>
           </w:rPr>
-          <w:t>protobuf</w:t>
-        </w:r>
-        <w:proofErr w:type="spellEnd"/>
+          <w:t>fraillt/bitsery: Your binary serialization library</w:t>
+        </w:r>
+      </w:hyperlink>
+    </w:p>
+    <w:p>
+      <w:pPr>
+        <w:rPr>
+          <w:lang w:val="en-US"/>
+        </w:rPr>
+      </w:pPr>
+      <w:hyperlink r:id="rId13" w:history="1">
         <w:r>
           <w:rPr>
             <w:rStyle w:val="ac"/>
             <w:lang w:val="en-US"/>
           </w:rPr>
-          <w:t>: Protocol Buffers - Google's data interchange format</w:t>
+          <w:t>liteserver/binn: Binary Serialization</w:t>
         </w:r>
       </w:hyperlink>
     </w:p>
@@ -2103,154 +1876,100 @@
           <w:lang w:val="en-US"/>
         </w:rPr>
       </w:pPr>
-      <w:hyperlink r:id="rId11" w:history="1">
-        <w:proofErr w:type="spellStart"/>
+      <w:hyperlink r:id="rId14" w:history="1">
         <w:r>
           <w:rPr>
             <w:rStyle w:val="ac"/>
             <w:lang w:val="en-US"/>
           </w:rPr>
-          <w:t>FlatBuffers</w:t>
-        </w:r>
-        <w:proofErr w:type="spellEnd"/>
+          <w:t>CBOR - Wikipedia</w:t>
+        </w:r>
+      </w:hyperlink>
+      <w:r>
+        <w:rPr>
+          <w:lang w:val="en-US"/>
+        </w:rPr>
+        <w:t xml:space="preserve"> </w:t>
+      </w:r>
+      <w:hyperlink r:id="rId15" w:history="1">
         <w:r>
           <w:rPr>
             <w:rStyle w:val="ac"/>
             <w:lang w:val="en-US"/>
           </w:rPr>
-          <w:t xml:space="preserve"> Docs</w:t>
-        </w:r>
-      </w:hyperlink>
-    </w:p>
-    <w:p>
-      <w:hyperlink r:id="rId12" w:history="1">
-        <w:proofErr w:type="spellStart"/>
+          <w:t xml:space="preserve">CBOR — </w:t>
+        </w:r>
+        <w:r>
+          <w:rPr>
+            <w:rStyle w:val="ac"/>
+          </w:rPr>
+          <w:t>новый</w:t>
+        </w:r>
         <w:r>
           <w:rPr>
             <w:rStyle w:val="ac"/>
             <w:lang w:val="en-US"/>
           </w:rPr>
-          <w:t>fraillt</w:t>
-        </w:r>
-        <w:proofErr w:type="spellEnd"/>
+          <w:t xml:space="preserve"> </w:t>
+        </w:r>
+        <w:r>
+          <w:rPr>
+            <w:rStyle w:val="ac"/>
+          </w:rPr>
+          <w:t>бинарный</w:t>
+        </w:r>
         <w:r>
           <w:rPr>
             <w:rStyle w:val="ac"/>
             <w:lang w:val="en-US"/>
           </w:rPr>
-          <w:t>/</w:t>
-        </w:r>
-        <w:proofErr w:type="spellStart"/>
+          <w:t xml:space="preserve"> </w:t>
+        </w:r>
+        <w:r>
+          <w:rPr>
+            <w:rStyle w:val="ac"/>
+          </w:rPr>
+          <w:t>формат</w:t>
+        </w:r>
         <w:r>
           <w:rPr>
             <w:rStyle w:val="ac"/>
             <w:lang w:val="en-US"/>
           </w:rPr>
-          <w:t>bitsery</w:t>
-        </w:r>
-        <w:proofErr w:type="spellEnd"/>
+          <w:t xml:space="preserve"> </w:t>
+        </w:r>
+        <w:r>
+          <w:rPr>
+            <w:rStyle w:val="ac"/>
+          </w:rPr>
+          <w:t>представления</w:t>
+        </w:r>
         <w:r>
           <w:rPr>
             <w:rStyle w:val="ac"/>
             <w:lang w:val="en-US"/>
           </w:rPr>
-          <w:t>: Your binary serialization library</w:t>
-        </w:r>
-      </w:hyperlink>
-    </w:p>
-    <w:p>
-      <w:hyperlink r:id="rId13" w:history="1">
-        <w:proofErr w:type="spellStart"/>
-        <w:r>
-          <w:rPr>
-            <w:rStyle w:val="ac"/>
-          </w:rPr>
-          <w:t>liteserver</w:t>
-        </w:r>
-        <w:proofErr w:type="spellEnd"/>
-        <w:r>
-          <w:rPr>
-            <w:rStyle w:val="ac"/>
-          </w:rPr>
-          <w:t>/</w:t>
-        </w:r>
-        <w:proofErr w:type="spellStart"/>
-        <w:r>
-          <w:rPr>
-            <w:rStyle w:val="ac"/>
-          </w:rPr>
-          <w:t>binn</w:t>
-        </w:r>
-        <w:proofErr w:type="spellEnd"/>
-        <w:r>
-          <w:rPr>
-            <w:rStyle w:val="ac"/>
-          </w:rPr>
-          <w:t xml:space="preserve">: </w:t>
-        </w:r>
-        <w:proofErr w:type="spellStart"/>
-        <w:r>
-          <w:rPr>
-            <w:rStyle w:val="ac"/>
-          </w:rPr>
-          <w:t>Binary</w:t>
-        </w:r>
-        <w:proofErr w:type="spellEnd"/>
-        <w:r>
-          <w:rPr>
-            <w:rStyle w:val="ac"/>
-          </w:rPr>
           <w:t xml:space="preserve"> </w:t>
         </w:r>
-        <w:proofErr w:type="spellStart"/>
-        <w:r>
-          <w:rPr>
-            <w:rStyle w:val="ac"/>
-          </w:rPr>
-          <w:t>Serialization</w:t>
-        </w:r>
-        <w:proofErr w:type="spellEnd"/>
-      </w:hyperlink>
-    </w:p>
-    <w:p>
-      <w:hyperlink r:id="rId14" w:history="1">
-        <w:r>
-          <w:rPr>
-            <w:rStyle w:val="ac"/>
-          </w:rPr>
-          <w:t>CBOR - Wikipedia</w:t>
-        </w:r>
-      </w:hyperlink>
-      <w:r>
-        <w:t xml:space="preserve"> </w:t>
-      </w:r>
-      <w:hyperlink r:id="rId15" w:history="1">
-        <w:r>
-          <w:rPr>
-            <w:rStyle w:val="ac"/>
-          </w:rPr>
-          <w:t>CBOR</w:t>
-        </w:r>
-        <w:r>
-          <w:rPr>
-            <w:rStyle w:val="ac"/>
-          </w:rPr>
-          <w:t xml:space="preserve"> </w:t>
-        </w:r>
-        <w:r>
-          <w:rPr>
-            <w:rStyle w:val="ac"/>
-          </w:rPr>
-          <w:t xml:space="preserve">— новый бинарный формат представления данных / </w:t>
-        </w:r>
-        <w:proofErr w:type="spellStart"/>
+        <w:r>
+          <w:rPr>
+            <w:rStyle w:val="ac"/>
+          </w:rPr>
+          <w:t>данных</w:t>
+        </w:r>
+        <w:r>
+          <w:rPr>
+            <w:rStyle w:val="ac"/>
+            <w:lang w:val="en-US"/>
+          </w:rPr>
+          <w:t xml:space="preserve"> / </w:t>
+        </w:r>
         <w:r>
           <w:rPr>
             <w:rStyle w:val="ac"/>
           </w:rPr>
           <w:t>Хабр</w:t>
         </w:r>
-        <w:proofErr w:type="spellEnd"/>
       </w:hyperlink>
     </w:p>
     <w:p>
@@ -2258,13 +1977,23 @@
         <w:tabs>
           <w:tab w:val="left" w:pos="1150"/>
         </w:tabs>
+        <w:rPr>
+          <w:lang w:val="en-US"/>
+        </w:rPr>
       </w:pPr>
       <w:hyperlink r:id="rId16" w:history="1">
         <w:r>
           <w:rPr>
             <w:rStyle w:val="ac"/>
-          </w:rPr>
-          <w:t>RIFF — Википедия</w:t>
+            <w:lang w:val="en-US"/>
+          </w:rPr>
+          <w:t xml:space="preserve">RIFF — </w:t>
+        </w:r>
+        <w:r>
+          <w:rPr>
+            <w:rStyle w:val="ac"/>
+          </w:rPr>
+          <w:t>Википедия</w:t>
         </w:r>
       </w:hyperlink>
     </w:p>
@@ -2317,81 +2046,22 @@
           <w:rPr>
             <w:rStyle w:val="ac"/>
           </w:rPr>
-          <w:t>Полноценная бин</w:t>
-        </w:r>
-        <w:r>
-          <w:rPr>
-            <w:rStyle w:val="ac"/>
-          </w:rPr>
-          <w:t>а</w:t>
-        </w:r>
-        <w:r>
-          <w:rPr>
-            <w:rStyle w:val="ac"/>
-          </w:rPr>
-          <w:t xml:space="preserve">рная замена XML / </w:t>
-        </w:r>
-        <w:proofErr w:type="spellStart"/>
-        <w:r>
-          <w:rPr>
-            <w:rStyle w:val="ac"/>
-          </w:rPr>
-          <w:t>Хабр</w:t>
-        </w:r>
-        <w:proofErr w:type="spellEnd"/>
+          <w:t>Полноценная бинарная замена XML / Хабр</w:t>
+        </w:r>
       </w:hyperlink>
     </w:p>
     <w:p>
-      <w:pPr>
-        <w:rPr>
-          <w:lang w:val="en-US"/>
-        </w:rPr>
-      </w:pPr>
       <w:hyperlink r:id="rId20" w:history="1">
-        <w:proofErr w:type="spellStart"/>
-        <w:r>
-          <w:rPr>
-            <w:rStyle w:val="ac"/>
-          </w:rPr>
-          <w:t>Tree</w:t>
-        </w:r>
-        <w:proofErr w:type="spellEnd"/>
-        <w:r>
-          <w:rPr>
-            <w:rStyle w:val="ac"/>
-          </w:rPr>
-          <w:t xml:space="preserve"> — убийца JSON, XML, </w:t>
-        </w:r>
-        <w:r>
-          <w:rPr>
-            <w:rStyle w:val="ac"/>
-          </w:rPr>
-          <w:t>Y</w:t>
-        </w:r>
-        <w:r>
-          <w:rPr>
-            <w:rStyle w:val="ac"/>
-          </w:rPr>
-          <w:t xml:space="preserve">AML и иже с ними / </w:t>
-        </w:r>
-        <w:proofErr w:type="spellStart"/>
-        <w:r>
-          <w:rPr>
-            <w:rStyle w:val="ac"/>
-          </w:rPr>
-          <w:t>Хабр</w:t>
-        </w:r>
-        <w:proofErr w:type="spellEnd"/>
+        <w:r>
+          <w:rPr>
+            <w:rStyle w:val="ac"/>
+          </w:rPr>
+          <w:t>Tree — убийца JSON, XML, YAML и иже с ними / Хабр</w:t>
+        </w:r>
       </w:hyperlink>
     </w:p>
     <w:bookmarkEnd w:id="0"/>
-    <w:p>
-      <w:pPr>
-        <w:rPr>
-          <w:lang w:val="en-US"/>
-        </w:rPr>
-      </w:pPr>
-    </w:p>
+    <w:p/>
     <w:p>
       <w:pPr>
         <w:rPr>
@@ -2695,15 +2365,6 @@
   </w:num>
   <w:num w:numId="2" w16cid:durableId="1407453292">
     <w:abstractNumId w:val="1"/>
-    <w:lvlOverride w:ilvl="0"/>
-    <w:lvlOverride w:ilvl="1"/>
-    <w:lvlOverride w:ilvl="2"/>
-    <w:lvlOverride w:ilvl="3"/>
-    <w:lvlOverride w:ilvl="4"/>
-    <w:lvlOverride w:ilvl="5"/>
-    <w:lvlOverride w:ilvl="6"/>
-    <w:lvlOverride w:ilvl="7"/>
-    <w:lvlOverride w:ilvl="8"/>
   </w:num>
 </w:numbering>
 </file>
@@ -3311,6 +2972,7 @@
   <w:style w:type="character" w:default="1" w:styleId="a0">
     <w:name w:val="Default Paragraph Font"/>
     <w:uiPriority w:val="1"/>
+    <w:semiHidden/>
     <w:unhideWhenUsed/>
   </w:style>
   <w:style w:type="table" w:default="1" w:styleId="a1">

</xml_diff>